<commit_message>
Editorial: single version with cover image and JW tracked changes
Co-Authored-By: Claude Fable 5.1 <noreply@anthropic.com>
Claude-Session: https://claude.ai/code/session_01GDsn8zC9DL3iqGx5YEeZQh
</commit_message>
<xml_diff>
--- a/files/ACGME_CPR_Editorial_Wilson.docx
+++ b/files/ACGME_CPR_Editorial_Wilson.docx
@@ -4,12 +4,12 @@
   <w:body>
     <w:p>
       <w:pPr>
-        <w:spacing w:after="120"/>
+        <w:spacing w:after="200"/>
       </w:pPr>
       <w:r>
         <w:drawing>
           <wp:inline distT="0" distB="0" distL="0" distR="0">
-            <wp:extent cx="1600200" cy="647700"/>
+            <wp:extent cx="5943600" cy="3343275"/>
             <wp:effectExtent t="0" r="0" b="0" l="0"/>
             <wp:docPr id="1" name="" descr="" title=""/>
             <wp:cNvGraphicFramePr>
@@ -34,7 +34,7 @@
                   <pic:spPr bwMode="auto">
                     <a:xfrm>
                       <a:off x="0" y="0"/>
-                      <a:ext cx="1600200" cy="647700"/>
+                      <a:ext cx="5943600" cy="3343275"/>
                     </a:xfrm>
                     <a:prstGeom prst="rect">
                       <a:avLst/>
@@ -49,40 +49,23 @@
     </w:p>
     <w:p>
       <w:pPr>
-        <w:spacing w:after="40"/>
-      </w:pPr>
-      <w:r>
-        <w:rPr>
-          <w:rFonts w:ascii="Calibri" w:cs="Calibri" w:eastAsia="Calibri" w:hAnsi="Calibri"/>
-          <w:b/>
-          <w:bCs/>
-          <w:color w:val="595959"/>
-          <w:spacing w:val="40"/>
-          <w:sz w:val="18"/>
-          <w:szCs w:val="18"/>
-        </w:rPr>
-        <w:t xml:space="preserve">OPINION  •  GRADUATE MEDICAL EDUCATION</w:t>
-      </w:r>
-    </w:p>
-    <w:p>
-      <w:pPr>
-        <w:spacing w:after="80"/>
-      </w:pPr>
-      <w:r>
-        <w:rPr>
-          <w:rFonts w:ascii="Calibri" w:cs="Calibri" w:eastAsia="Calibri" w:hAnsi="Calibri"/>
-          <w:b/>
-          <w:bCs/>
-          <w:color w:val="006747"/>
-          <w:sz w:val="40"/>
-          <w:szCs w:val="40"/>
-        </w:rPr>
-        <w:t xml:space="preserve">The ACGME Is About to Make Emergency Medicine Training Cheaper. Not Better.</w:t>
-      </w:r>
-    </w:p>
-    <w:p>
-      <w:pPr>
         <w:spacing w:after="100"/>
+      </w:pPr>
+      <w:r>
+        <w:rPr>
+          <w:rFonts w:ascii="Calibri" w:cs="Calibri" w:eastAsia="Calibri" w:hAnsi="Calibri"/>
+          <w:b/>
+          <w:bCs/>
+          <w:color w:val="006747"/>
+          <w:sz w:val="34"/>
+          <w:szCs w:val="34"/>
+        </w:rPr>
+        <w:t xml:space="preserve">Fewer Rules, Weaker Residency Programs, Less Faculty Development: How the ACGME’s Proposed Common Program Requirements Make Emergency Medicine Worse</w:t>
+      </w:r>
+    </w:p>
+    <w:p>
+      <w:pPr>
+        <w:spacing w:after="120" w:before="0" w:line="264"/>
       </w:pPr>
       <w:r>
         <w:rPr>
@@ -98,21 +81,6 @@
     </w:p>
     <w:p>
       <w:pPr>
-        <w:spacing w:after="40"/>
-      </w:pPr>
-      <w:r>
-        <w:rPr>
-          <w:rFonts w:ascii="Calibri" w:cs="Calibri" w:eastAsia="Calibri" w:hAnsi="Calibri"/>
-          <w:b/>
-          <w:bCs/>
-          <w:sz w:val="22"/>
-          <w:szCs w:val="22"/>
-        </w:rPr>
-        <w:t xml:space="preserve">By Jason W. Wilson, MD, PhD</w:t>
-      </w:r>
-    </w:p>
-    <w:p>
-      <w:pPr>
         <w:pBdr>
           <w:bottom w:val="single" w:color="006747" w:sz="6" w:space="8"/>
         </w:pBdr>
@@ -121,62 +89,69 @@
       <w:r>
         <w:rPr>
           <w:rFonts w:ascii="Calibri" w:cs="Calibri" w:eastAsia="Calibri" w:hAnsi="Calibri"/>
+          <w:b/>
+          <w:bCs/>
+          <w:sz w:val="21"/>
+          <w:szCs w:val="21"/>
+        </w:rPr>
+        <w:t xml:space="preserve">By Jason W. Wilson, MD, PhD</w:t>
+      </w:r>
+      <w:r>
+        <w:rPr>
+          <w:rFonts w:ascii="Calibri" w:cs="Calibri" w:eastAsia="Calibri" w:hAnsi="Calibri"/>
           <w:color w:val="595959"/>
           <w:sz w:val="19"/>
           <w:szCs w:val="19"/>
         </w:rPr>
-        <w:t xml:space="preserve">Professor and Founding Chair, Department of Emergency Medicine, USF Health Morsani College of Medicine. Chief of Emergency Medicine, Tampa General Hospital  •  October 7, 2026</w:t>
-      </w:r>
-    </w:p>
-    <w:p>
-      <w:pPr>
-        <w:spacing w:after="80" w:line="252"/>
-        <w:jc w:val="both"/>
-      </w:pPr>
-      <w:r>
-        <w:rPr>
-          <w:rFonts w:ascii="Cambria" w:cs="Cambria" w:eastAsia="Cambria" w:hAnsi="Cambria"/>
-          <w:sz w:val="23"/>
-          <w:szCs w:val="23"/>
-        </w:rPr>
-        <w:t xml:space="preserve">Since 2014, ACGME-accredited emergency medicine residencies have grown from 160 to 304, and 86 percent of new programs are at non-university corporate, private equity, or community sites. Those programs have fewer faculty, less protected time, less rank advancement, less funded research, less student teaching, and lower scholarly productivity, which limits new academic faculty and stunts the science.</w:t>
-      </w:r>
-    </w:p>
-    <w:p>
-      <w:pPr>
-        <w:spacing w:after="80" w:line="252"/>
-        <w:jc w:val="both"/>
-      </w:pPr>
-      <w:r>
-        <w:rPr>
-          <w:rFonts w:ascii="Cambria" w:cs="Cambria" w:eastAsia="Cambria" w:hAnsi="Cambria"/>
-          <w:sz w:val="23"/>
-          <w:szCs w:val="23"/>
-        </w:rPr>
-        <w:t xml:space="preserve">ACGME requirements set a program's minimums, including protected faculty time and scholarly activity. On September 8, the ACGME posted a proposed major revision of the Common Program Requirements, the rules governing every residency, presented as a 43 percent reduction in requirements. Comments close October 22. If you train residents, supervise them, or are one, you have two weeks.</w:t>
+        <w:t xml:space="preserve">  •  Professor and Founding Chair, Department of Emergency Medicine, USF Health Morsani College of Medicine; Chief of Emergency Medicine, Tampa General Hospital  •  October 8, 2026</w:t>
+      </w:r>
+    </w:p>
+    <w:p>
+      <w:pPr>
+        <w:spacing w:after="100" w:before="0" w:line="264"/>
+      </w:pPr>
+      <w:r>
+        <w:rPr>
+          <w:rFonts w:ascii="Cambria" w:cs="Cambria" w:eastAsia="Cambria" w:hAnsi="Cambria"/>
+          <w:sz w:val="23"/>
+          <w:szCs w:val="23"/>
+        </w:rPr>
+        <w:t xml:space="preserve">Since 2014, ACGME-accredited emergency medicine residencies have grown from 160 to 304, and 86 percent of new programs are at non-university corporate, private equity, or community sites. Those programs have fewer faculty, less protected time, less rank advancement, less funded research, less student teaching, and lower scholarly productivity, which limits new academic faculty and stunts the science. ACGME requirements set a program's minimums, including protected faculty time and scholarly activity.</w:t>
+      </w:r>
+    </w:p>
+    <w:p>
+      <w:pPr>
+        <w:spacing w:after="100" w:before="0" w:line="264"/>
+      </w:pPr>
+      <w:r>
+        <w:rPr>
+          <w:rFonts w:ascii="Cambria" w:cs="Cambria" w:eastAsia="Cambria" w:hAnsi="Cambria"/>
+          <w:sz w:val="23"/>
+          <w:szCs w:val="23"/>
+        </w:rPr>
+        <w:t xml:space="preserve">On September 8, the ACGME posted a proposed major revision of the Common Program Requirements, the rules governing every residency, presented as a 43% reduction in requirements. If you train residents, supervise them, or are one, you have two weeks to comment (they close October 22). If you care about academic integrity and faculty development, this matters.</w:t>
       </w:r>
     </w:p>
     <w:p>
       <w:pPr>
         <w:keepNext/>
-        <w:spacing w:after="50" w:before="140"/>
-      </w:pPr>
-      <w:r>
-        <w:rPr>
-          <w:rFonts w:ascii="Calibri" w:cs="Calibri" w:eastAsia="Calibri" w:hAnsi="Calibri"/>
-          <w:b/>
-          <w:bCs/>
-          <w:color w:val="006747"/>
-          <w:sz w:val="24"/>
-          <w:szCs w:val="24"/>
+        <w:spacing w:after="60" w:before="180"/>
+      </w:pPr>
+      <w:r>
+        <w:rPr>
+          <w:rFonts w:ascii="Calibri" w:cs="Calibri" w:eastAsia="Calibri" w:hAnsi="Calibri"/>
+          <w:b/>
+          <w:bCs/>
+          <w:color w:val="006747"/>
+          <w:sz w:val="25"/>
+          <w:szCs w:val="25"/>
         </w:rPr>
         <w:t xml:space="preserve">The Proposal</w:t>
       </w:r>
     </w:p>
     <w:p>
       <w:pPr>
-        <w:spacing w:after="80" w:line="252"/>
-        <w:jc w:val="both"/>
+        <w:spacing w:after="100" w:before="0" w:line="264"/>
       </w:pPr>
       <w:r>
         <w:rPr>
@@ -190,24 +165,23 @@
     <w:p>
       <w:pPr>
         <w:keepNext/>
-        <w:spacing w:after="50" w:before="140"/>
-      </w:pPr>
-      <w:r>
-        <w:rPr>
-          <w:rFonts w:ascii="Calibri" w:cs="Calibri" w:eastAsia="Calibri" w:hAnsi="Calibri"/>
-          <w:b/>
-          <w:bCs/>
-          <w:color w:val="006747"/>
-          <w:sz w:val="24"/>
-          <w:szCs w:val="24"/>
+        <w:spacing w:after="60" w:before="180"/>
+      </w:pPr>
+      <w:r>
+        <w:rPr>
+          <w:rFonts w:ascii="Calibri" w:cs="Calibri" w:eastAsia="Calibri" w:hAnsi="Calibri"/>
+          <w:b/>
+          <w:bCs/>
+          <w:color w:val="006747"/>
+          <w:sz w:val="25"/>
+          <w:szCs w:val="25"/>
         </w:rPr>
         <w:t xml:space="preserve">Core Faculty</w:t>
       </w:r>
     </w:p>
     <w:p>
       <w:pPr>
-        <w:spacing w:after="80" w:line="252"/>
-        <w:jc w:val="both"/>
+        <w:spacing w:after="100" w:before="0" w:line="264"/>
       </w:pPr>
       <w:r>
         <w:rPr>
@@ -221,24 +195,23 @@
     <w:p>
       <w:pPr>
         <w:keepNext/>
-        <w:spacing w:after="50" w:before="140"/>
-      </w:pPr>
-      <w:r>
-        <w:rPr>
-          <w:rFonts w:ascii="Calibri" w:cs="Calibri" w:eastAsia="Calibri" w:hAnsi="Calibri"/>
-          <w:b/>
-          <w:bCs/>
-          <w:color w:val="006747"/>
-          <w:sz w:val="24"/>
-          <w:szCs w:val="24"/>
+        <w:spacing w:after="60" w:before="180"/>
+      </w:pPr>
+      <w:r>
+        <w:rPr>
+          <w:rFonts w:ascii="Calibri" w:cs="Calibri" w:eastAsia="Calibri" w:hAnsi="Calibri"/>
+          <w:b/>
+          <w:bCs/>
+          <w:color w:val="006747"/>
+          <w:sz w:val="25"/>
+          <w:szCs w:val="25"/>
         </w:rPr>
         <w:t xml:space="preserve">Program Director</w:t>
       </w:r>
     </w:p>
     <w:p>
       <w:pPr>
-        <w:spacing w:after="80" w:line="252"/>
-        <w:jc w:val="both"/>
+        <w:spacing w:after="100" w:before="0" w:line="264"/>
       </w:pPr>
       <w:r>
         <w:rPr>
@@ -252,24 +225,23 @@
     <w:p>
       <w:pPr>
         <w:keepNext/>
-        <w:spacing w:after="50" w:before="140"/>
-      </w:pPr>
-      <w:r>
-        <w:rPr>
-          <w:rFonts w:ascii="Calibri" w:cs="Calibri" w:eastAsia="Calibri" w:hAnsi="Calibri"/>
-          <w:b/>
-          <w:bCs/>
-          <w:color w:val="006747"/>
-          <w:sz w:val="24"/>
-          <w:szCs w:val="24"/>
+        <w:spacing w:after="60" w:before="180"/>
+      </w:pPr>
+      <w:r>
+        <w:rPr>
+          <w:rFonts w:ascii="Calibri" w:cs="Calibri" w:eastAsia="Calibri" w:hAnsi="Calibri"/>
+          <w:b/>
+          <w:bCs/>
+          <w:color w:val="006747"/>
+          <w:sz w:val="25"/>
+          <w:szCs w:val="25"/>
         </w:rPr>
         <w:t xml:space="preserve">Faculty</w:t>
       </w:r>
     </w:p>
     <w:p>
       <w:pPr>
-        <w:spacing w:after="80" w:line="252"/>
-        <w:jc w:val="both"/>
+        <w:spacing w:after="100" w:before="0" w:line="264"/>
       </w:pPr>
       <w:r>
         <w:rPr>
@@ -283,24 +255,23 @@
     <w:p>
       <w:pPr>
         <w:keepNext/>
-        <w:spacing w:after="50" w:before="140"/>
-      </w:pPr>
-      <w:r>
-        <w:rPr>
-          <w:rFonts w:ascii="Calibri" w:cs="Calibri" w:eastAsia="Calibri" w:hAnsi="Calibri"/>
-          <w:b/>
-          <w:bCs/>
-          <w:color w:val="006747"/>
-          <w:sz w:val="24"/>
-          <w:szCs w:val="24"/>
+        <w:spacing w:after="60" w:before="180"/>
+      </w:pPr>
+      <w:r>
+        <w:rPr>
+          <w:rFonts w:ascii="Calibri" w:cs="Calibri" w:eastAsia="Calibri" w:hAnsi="Calibri"/>
+          <w:b/>
+          <w:bCs/>
+          <w:color w:val="006747"/>
+          <w:sz w:val="25"/>
+          <w:szCs w:val="25"/>
         </w:rPr>
         <w:t xml:space="preserve">Scholarship</w:t>
       </w:r>
     </w:p>
     <w:p>
       <w:pPr>
-        <w:spacing w:after="80" w:line="252"/>
-        <w:jc w:val="both"/>
+        <w:spacing w:after="100" w:before="0" w:line="264"/>
       </w:pPr>
       <w:r>
         <w:rPr>
@@ -314,24 +285,23 @@
     <w:p>
       <w:pPr>
         <w:keepNext/>
-        <w:spacing w:after="50" w:before="140"/>
-      </w:pPr>
-      <w:r>
-        <w:rPr>
-          <w:rFonts w:ascii="Calibri" w:cs="Calibri" w:eastAsia="Calibri" w:hAnsi="Calibri"/>
-          <w:b/>
-          <w:bCs/>
-          <w:color w:val="006747"/>
-          <w:sz w:val="24"/>
-          <w:szCs w:val="24"/>
+        <w:spacing w:after="60" w:before="180"/>
+      </w:pPr>
+      <w:r>
+        <w:rPr>
+          <w:rFonts w:ascii="Calibri" w:cs="Calibri" w:eastAsia="Calibri" w:hAnsi="Calibri"/>
+          <w:b/>
+          <w:bCs/>
+          <w:color w:val="006747"/>
+          <w:sz w:val="25"/>
+          <w:szCs w:val="25"/>
         </w:rPr>
         <w:t xml:space="preserve">Patient Care</w:t>
       </w:r>
     </w:p>
     <w:p>
       <w:pPr>
-        <w:spacing w:after="80" w:line="252"/>
-        <w:jc w:val="both"/>
+        <w:spacing w:after="100" w:before="0" w:line="264"/>
       </w:pPr>
       <w:r>
         <w:rPr>
@@ -345,24 +315,23 @@
     <w:p>
       <w:pPr>
         <w:keepNext/>
-        <w:spacing w:after="50" w:before="140"/>
-      </w:pPr>
-      <w:r>
-        <w:rPr>
-          <w:rFonts w:ascii="Calibri" w:cs="Calibri" w:eastAsia="Calibri" w:hAnsi="Calibri"/>
-          <w:b/>
-          <w:bCs/>
-          <w:color w:val="006747"/>
-          <w:sz w:val="24"/>
-          <w:szCs w:val="24"/>
+        <w:spacing w:after="60" w:before="180"/>
+      </w:pPr>
+      <w:r>
+        <w:rPr>
+          <w:rFonts w:ascii="Calibri" w:cs="Calibri" w:eastAsia="Calibri" w:hAnsi="Calibri"/>
+          <w:b/>
+          <w:bCs/>
+          <w:color w:val="006747"/>
+          <w:sz w:val="25"/>
+          <w:szCs w:val="25"/>
         </w:rPr>
         <w:t xml:space="preserve">The Environment This Lands In</w:t>
       </w:r>
     </w:p>
     <w:p>
       <w:pPr>
-        <w:spacing w:after="80" w:line="252"/>
-        <w:jc w:val="both"/>
+        <w:spacing w:after="100" w:before="0" w:line="264"/>
       </w:pPr>
       <w:r>
         <w:rPr>
@@ -375,8 +344,7 @@
     </w:p>
     <w:p>
       <w:pPr>
-        <w:spacing w:after="80" w:line="252"/>
-        <w:jc w:val="both"/>
+        <w:spacing w:after="100" w:before="0" w:line="264"/>
       </w:pPr>
       <w:r>
         <w:rPr>
@@ -387,92 +355,56 @@
         <w:t xml:space="preserve">Lowering the floor widens the variability. Well-resourced departments will keep 1:3, publication, and their director standards, because that is how academic departments grow people. State university programs may be held to the ACGME minimum by their funders, and corporate groups will welcome the savings. All of academia faces this cost-cutting approach to teaching, which grows neither faculty nor discipline. Lower cost and less regulation suit the corporate and private-equity employers behind this growth. The ACGME should be the counterweight protecting patients, trainees, and faculty.</w:t>
       </w:r>
     </w:p>
-    <w:tbl>
-      <w:tblPr>
-        <w:tblW w:type="dxa" w:w="9360"/>
-        <w:tblBorders>
-          <w:top w:val="single" w:color="auto" w:sz="4"/>
-          <w:left w:val="single" w:color="auto" w:sz="4"/>
-          <w:bottom w:val="single" w:color="auto" w:sz="4"/>
-          <w:right w:val="single" w:color="auto" w:sz="4"/>
-          <w:insideH w:val="single" w:color="auto" w:sz="4"/>
-          <w:insideV w:val="single" w:color="auto" w:sz="4"/>
-        </w:tblBorders>
-      </w:tblPr>
-      <w:tblGrid>
-        <w:gridCol w:w="9360"/>
-      </w:tblGrid>
-      <w:tr>
-        <w:tc>
-          <w:tcPr>
-            <w:tcW w:type="dxa" w:w="9360"/>
-            <w:tcBorders>
-              <w:top w:val="single" w:color="006747" w:sz="12"/>
-              <w:left w:val="none" w:color="FFFFFF" w:sz="0"/>
-              <w:bottom w:val="single" w:color="006747" w:sz="12"/>
-              <w:right w:val="none" w:color="FFFFFF" w:sz="0"/>
-            </w:tcBorders>
-            <w:tcMar>
-              <w:top w:type="dxa" w:w="140"/>
-              <w:left w:type="dxa" w:w="300"/>
-              <w:bottom w:type="dxa" w:w="140"/>
-              <w:right w:type="dxa" w:w="300"/>
-            </w:tcMar>
-          </w:tcPr>
-          <w:p>
-            <w:pPr>
-              <w:jc w:val="center"/>
-            </w:pPr>
-            <w:r>
-              <w:rPr>
-                <w:rFonts w:ascii="Cambria" w:cs="Cambria" w:eastAsia="Cambria" w:hAnsi="Cambria"/>
-                <w:i/>
-                <w:iCs/>
-                <w:color w:val="006747"/>
-                <w:sz w:val="26"/>
-                <w:szCs w:val="26"/>
-              </w:rPr>
-              <w:t xml:space="preserve">Local program expectations are not the same thing as specialty-wide accreditation standards. That difference is the whole point of accreditation.</w:t>
-            </w:r>
-          </w:p>
-        </w:tc>
-      </w:tr>
-    </w:tbl>
     <w:p>
       <w:pPr>
         <w:keepNext/>
-        <w:spacing w:after="50" w:before="140"/>
-      </w:pPr>
-      <w:r>
-        <w:rPr>
-          <w:rFonts w:ascii="Calibri" w:cs="Calibri" w:eastAsia="Calibri" w:hAnsi="Calibri"/>
-          <w:b/>
-          <w:bCs/>
-          <w:color w:val="006747"/>
-          <w:sz w:val="24"/>
-          <w:szCs w:val="24"/>
-        </w:rPr>
-        <w:t xml:space="preserve">Where I Agree</w:t>
-      </w:r>
-    </w:p>
-    <w:p>
-      <w:pPr>
-        <w:spacing w:after="80" w:line="252"/>
-        <w:jc w:val="both"/>
-      </w:pPr>
-      <w:r>
-        <w:rPr>
-          <w:rFonts w:ascii="Cambria" w:cs="Cambria" w:eastAsia="Cambria" w:hAnsi="Cambria"/>
-          <w:sz w:val="23"/>
-          <w:szCs w:val="23"/>
-        </w:rPr>
-        <w:t xml:space="preserve">I support the 90 percent ultimate board certification standard, a real outcome requirement, though the new two-of-three first-time rule forgives a failed cohort, and a program not ready to train should not get that pass. The environment-of-inquiry expectation and artificial intelligence language are also right.</w:t>
-      </w:r>
-    </w:p>
-    <w:p>
-      <w:pPr>
-        <w:spacing w:after="80" w:line="252"/>
-        <w:jc w:val="both"/>
+        <w:spacing w:after="60" w:before="180"/>
+      </w:pPr>
+      <w:r>
+        <w:rPr>
+          <w:rFonts w:ascii="Calibri" w:cs="Calibri" w:eastAsia="Calibri" w:hAnsi="Calibri"/>
+          <w:b/>
+          <w:bCs/>
+          <w:color w:val="006747"/>
+          <w:sz w:val="25"/>
+          <w:szCs w:val="25"/>
+        </w:rPr>
+        <w:t xml:space="preserve">Board Pass Rates</w:t>
+      </w:r>
+    </w:p>
+    <w:p>
+      <w:pPr>
+        <w:spacing w:after="100" w:before="0" w:line="264"/>
+      </w:pPr>
+      <w:r>
+        <w:rPr>
+          <w:rFonts w:ascii="Cambria" w:cs="Cambria" w:eastAsia="Cambria" w:hAnsi="Cambria"/>
+          <w:sz w:val="23"/>
+          <w:szCs w:val="23"/>
+        </w:rPr>
+        <w:t xml:space="preserve">The 90 percent ultimate board certification standard is a real outcome requirement, though the new two-of-three first-time rule forgives a failed cohort, and a program not ready to train should not get that pass.</w:t>
+      </w:r>
+    </w:p>
+    <w:p>
+      <w:pPr>
+        <w:keepNext/>
+        <w:spacing w:after="60" w:before="180"/>
+      </w:pPr>
+      <w:r>
+        <w:rPr>
+          <w:rFonts w:ascii="Calibri" w:cs="Calibri" w:eastAsia="Calibri" w:hAnsi="Calibri"/>
+          <w:b/>
+          <w:bCs/>
+          <w:color w:val="006747"/>
+          <w:sz w:val="25"/>
+          <w:szCs w:val="25"/>
+        </w:rPr>
+        <w:t xml:space="preserve">Work Hours</w:t>
+      </w:r>
+    </w:p>
+    <w:p>
+      <w:pPr>
+        <w:spacing w:after="100" w:before="0" w:line="264"/>
       </w:pPr>
       <w:r>
         <w:rPr>
@@ -486,24 +418,23 @@
     <w:p>
       <w:pPr>
         <w:keepNext/>
-        <w:spacing w:after="50" w:before="140"/>
-      </w:pPr>
-      <w:r>
-        <w:rPr>
-          <w:rFonts w:ascii="Calibri" w:cs="Calibri" w:eastAsia="Calibri" w:hAnsi="Calibri"/>
-          <w:b/>
-          <w:bCs/>
-          <w:color w:val="006747"/>
-          <w:sz w:val="24"/>
-          <w:szCs w:val="24"/>
+        <w:spacing w:after="60" w:before="180"/>
+      </w:pPr>
+      <w:r>
+        <w:rPr>
+          <w:rFonts w:ascii="Calibri" w:cs="Calibri" w:eastAsia="Calibri" w:hAnsi="Calibri"/>
+          <w:b/>
+          <w:bCs/>
+          <w:color w:val="006747"/>
+          <w:sz w:val="25"/>
+          <w:szCs w:val="25"/>
         </w:rPr>
         <w:t xml:space="preserve">The Role of the ACGME</w:t>
       </w:r>
     </w:p>
     <w:p>
       <w:pPr>
-        <w:spacing w:after="80" w:line="252"/>
-        <w:jc w:val="both"/>
+        <w:spacing w:after="100" w:before="0" w:line="264"/>
       </w:pPr>
       <w:r>
         <w:rPr>
@@ -517,37 +448,55 @@
     <w:p>
       <w:pPr>
         <w:keepNext/>
-        <w:spacing w:after="50" w:before="140"/>
-      </w:pPr>
-      <w:r>
-        <w:rPr>
-          <w:rFonts w:ascii="Calibri" w:cs="Calibri" w:eastAsia="Calibri" w:hAnsi="Calibri"/>
-          <w:b/>
-          <w:bCs/>
-          <w:color w:val="006747"/>
-          <w:sz w:val="24"/>
-          <w:szCs w:val="24"/>
+        <w:spacing w:after="60" w:before="180"/>
+      </w:pPr>
+      <w:r>
+        <w:rPr>
+          <w:rFonts w:ascii="Calibri" w:cs="Calibri" w:eastAsia="Calibri" w:hAnsi="Calibri"/>
+          <w:b/>
+          <w:bCs/>
+          <w:color w:val="006747"/>
+          <w:sz w:val="25"/>
+          <w:szCs w:val="25"/>
         </w:rPr>
         <w:t xml:space="preserve">Action Step</w:t>
       </w:r>
     </w:p>
     <w:p>
       <w:pPr>
-        <w:spacing w:after="80" w:line="252"/>
-        <w:jc w:val="both"/>
-      </w:pPr>
-      <w:r>
-        <w:rPr>
-          <w:rFonts w:ascii="Cambria" w:cs="Cambria" w:eastAsia="Cambria" w:hAnsi="Cambria"/>
-          <w:sz w:val="23"/>
-          <w:szCs w:val="23"/>
-        </w:rPr>
-        <w:t xml:space="preserve">The comment form is at acgme.org under Review and Comment, Common Program Requirements (Residency). I am asking every faculty member and resident to submit comments.</w:t>
-      </w:r>
-    </w:p>
-    <w:p>
-      <w:pPr>
-        <w:spacing w:after="80" w:before="60"/>
+        <w:spacing w:after="100" w:line="264"/>
+      </w:pPr>
+      <w:r>
+        <w:rPr>
+          <w:rFonts w:ascii="Cambria" w:cs="Cambria" w:eastAsia="Cambria" w:hAnsi="Cambria"/>
+          <w:sz w:val="23"/>
+          <w:szCs w:val="23"/>
+        </w:rPr>
+        <w:t xml:space="preserve">The comment form is at </w:t>
+      </w:r>
+      <w:hyperlink w:history="1" r:id="rId-p48ret12z2ryo4idmfmj">
+        <w:r>
+          <w:rPr>
+            <w:rStyle w:val="Hyperlink"/>
+            <w:rFonts w:ascii="Cambria" w:cs="Cambria" w:eastAsia="Cambria" w:hAnsi="Cambria"/>
+            <w:sz w:val="23"/>
+            <w:szCs w:val="23"/>
+          </w:rPr>
+          <w:t xml:space="preserve">acgme.org</w:t>
+        </w:r>
+      </w:hyperlink>
+      <w:r>
+        <w:rPr>
+          <w:rFonts w:ascii="Cambria" w:cs="Cambria" w:eastAsia="Cambria" w:hAnsi="Cambria"/>
+          <w:sz w:val="23"/>
+          <w:szCs w:val="23"/>
+        </w:rPr>
+        <w:t xml:space="preserve"> under Review and Comment, Common Program Requirements (Residency). I am asking every faculty member and resident to submit comments.</w:t>
+      </w:r>
+    </w:p>
+    <w:p>
+      <w:pPr>
+        <w:spacing w:after="120" w:before="60" w:line="264"/>
       </w:pPr>
       <w:r>
         <w:rPr>
@@ -560,7 +509,7 @@
         </w:rPr>
         <w:t xml:space="preserve">To view my responses and suggested considerations for your own response, please go to </w:t>
       </w:r>
-      <w:hyperlink w:history="1" r:id="rIdguz2y4nmyhrwxv5j9y8df">
+      <w:hyperlink w:history="1" r:id="rId-ueqlgtoyuzm0zgjfwpky">
         <w:r>
           <w:rPr>
             <w:rStyle w:val="Hyperlink"/>
@@ -590,7 +539,7 @@
         <w:pBdr>
           <w:top w:val="single" w:color="006747" w:sz="6" w:space="8"/>
         </w:pBdr>
-        <w:spacing w:after="40" w:before="200"/>
+        <w:spacing w:after="60" w:before="240"/>
       </w:pPr>
       <w:r>
         <w:rPr>
@@ -606,22 +555,64 @@
     </w:p>
     <w:p>
       <w:pPr>
-        <w:spacing w:before="120"/>
-      </w:pPr>
-      <w:r>
-        <w:rPr>
-          <w:rFonts w:ascii="Calibri" w:cs="Calibri" w:eastAsia="Calibri" w:hAnsi="Calibri"/>
+        <w:spacing w:before="80"/>
+      </w:pPr>
+      <w:r>
+        <w:rPr>
+          <w:rFonts w:ascii="Calibri" w:cs="Calibri" w:eastAsia="Calibri" w:hAnsi="Calibri"/>
+          <w:b/>
+          <w:bCs/>
           <w:color w:val="595959"/>
           <w:sz w:val="16"/>
           <w:szCs w:val="16"/>
         </w:rPr>
-        <w:t xml:space="preserve">Sources: ACGME, Proposed Major Revision of the Common Program Requirements (Residency), tracked-changes copy, Sept. 8, 2026. ACGME, Rationale and Impact Statement, Sept. 8, 2026. CORD, “Proposed ACGME Common Program Requirement Changes: What Could They Mean for Emergency Medicine?”, Oct. 2026.</w:t>
+        <w:t xml:space="preserve">Sources: </w:t>
+      </w:r>
+      <w:hyperlink w:history="1" r:id="rId6_s8ualvsevxucclggpml">
+        <w:r>
+          <w:rPr>
+            <w:rStyle w:val="Hyperlink"/>
+            <w:rFonts w:ascii="Calibri" w:cs="Calibri" w:eastAsia="Calibri" w:hAnsi="Calibri"/>
+            <w:sz w:val="16"/>
+            <w:szCs w:val="16"/>
+          </w:rPr>
+          <w:t xml:space="preserve">ACGME, Proposed Major Revision of the Common Program Requirements (Residency), tracked-changes copy, Sept. 8, 2026</w:t>
+        </w:r>
+      </w:hyperlink>
+      <w:r>
+        <w:rPr>
+          <w:rFonts w:ascii="Calibri" w:cs="Calibri" w:eastAsia="Calibri" w:hAnsi="Calibri"/>
+          <w:color w:val="595959"/>
+          <w:sz w:val="16"/>
+          <w:szCs w:val="16"/>
+        </w:rPr>
+        <w:t xml:space="preserve">. </w:t>
+      </w:r>
+      <w:hyperlink w:history="1" r:id="rIda-i8hzmhnx7wm_roqipyr">
+        <w:r>
+          <w:rPr>
+            <w:rStyle w:val="Hyperlink"/>
+            <w:rFonts w:ascii="Calibri" w:cs="Calibri" w:eastAsia="Calibri" w:hAnsi="Calibri"/>
+            <w:sz w:val="16"/>
+            <w:szCs w:val="16"/>
+          </w:rPr>
+          <w:t xml:space="preserve">ACGME, Rationale and Impact Statement, Sept. 8, 2026</w:t>
+        </w:r>
+      </w:hyperlink>
+      <w:r>
+        <w:rPr>
+          <w:rFonts w:ascii="Calibri" w:cs="Calibri" w:eastAsia="Calibri" w:hAnsi="Calibri"/>
+          <w:color w:val="595959"/>
+          <w:sz w:val="16"/>
+          <w:szCs w:val="16"/>
+        </w:rPr>
+        <w:t xml:space="preserve">. CORD, “Proposed ACGME Common Program Requirement Changes: What Could They Mean for Emergency Medicine?”, Oct. 2026. Program growth figures from the USF EM Faculty Census, Sept. 2026.</w:t>
       </w:r>
     </w:p>
     <w:sectPr>
       <w:footerReference w:type="default" r:id="rId7"/>
       <w:pgSz w:w="12240" w:h="15840" w:orient="portrait"/>
-      <w:pgMar w:top="900" w:right="1350" w:bottom="900" w:left="1350" w:header="708" w:footer="708" w:gutter="0"/>
+      <w:pgMar w:top="1080" w:right="1440" w:bottom="1000" w:left="1440" w:header="708" w:footer="708" w:gutter="0"/>
       <w:pgNumType/>
       <w:docGrid w:linePitch="360"/>
     </w:sectPr>

</xml_diff>

<commit_message>
Cover image wording update; editorial rebuilt with new cover
Co-Authored-By: Claude Fable 5.1 <noreply@anthropic.com>
Claude-Session: https://claude.ai/code/session_01GDsn8zC9DL3iqGx5YEeZQh
</commit_message>
<xml_diff>
--- a/files/ACGME_CPR_Editorial_Wilson.docx
+++ b/files/ACGME_CPR_Editorial_Wilson.docx
@@ -474,7 +474,7 @@
         </w:rPr>
         <w:t xml:space="preserve">The comment form is at </w:t>
       </w:r>
-      <w:hyperlink w:history="1" r:id="rId-p48ret12z2ryo4idmfmj">
+      <w:hyperlink w:history="1" r:id="rId8greavpje1pydjvmeyxgw">
         <w:r>
           <w:rPr>
             <w:rStyle w:val="Hyperlink"/>
@@ -509,7 +509,7 @@
         </w:rPr>
         <w:t xml:space="preserve">To view my responses and suggested considerations for your own response, please go to </w:t>
       </w:r>
-      <w:hyperlink w:history="1" r:id="rId-ueqlgtoyuzm0zgjfwpky">
+      <w:hyperlink w:history="1" r:id="rId3oz1-ue_rsh804ypzg6d7">
         <w:r>
           <w:rPr>
             <w:rStyle w:val="Hyperlink"/>
@@ -568,7 +568,7 @@
         </w:rPr>
         <w:t xml:space="preserve">Sources: </w:t>
       </w:r>
-      <w:hyperlink w:history="1" r:id="rId6_s8ualvsevxucclggpml">
+      <w:hyperlink w:history="1" r:id="rIdbjxkcvxcripbebdojowtb">
         <w:r>
           <w:rPr>
             <w:rStyle w:val="Hyperlink"/>
@@ -588,7 +588,7 @@
         </w:rPr>
         <w:t xml:space="preserve">. </w:t>
       </w:r>
-      <w:hyperlink w:history="1" r:id="rIda-i8hzmhnx7wm_roqipyr">
+      <w:hyperlink w:history="1" r:id="rIdhyid3akbluv3elivqo1-u">
         <w:r>
           <w:rPr>
             <w:rStyle w:val="Hyperlink"/>

</xml_diff>

<commit_message>
Editorial: JW dek and paragraph-order edits
Co-Authored-By: Claude Fable 5.1 <noreply@anthropic.com>
Claude-Session: https://claude.ai/code/session_01GDsn8zC9DL3iqGx5YEeZQh
</commit_message>
<xml_diff>
--- a/files/ACGME_CPR_Editorial_Wilson.docx
+++ b/files/ACGME_CPR_Editorial_Wilson.docx
@@ -76,7 +76,7 @@
           <w:sz w:val="24"/>
           <w:szCs w:val="24"/>
         </w:rPr>
-        <w:t xml:space="preserve">A 43 percent cut in accreditation requirements sounds like relief from bureaucracy. Read closely, it is a transfer of authority away from the specialties that know what a well-trained physician looks like.</w:t>
+        <w:t xml:space="preserve">A 43 percent cut in accreditation requirements sounds like relief from bureaucracy. Read closely, it is a transfer of authority away from the specialties that know what a well-trained physician looks like, and it erodes the academic mission to advance the science of EM.</w:t>
       </w:r>
     </w:p>
     <w:p>
@@ -116,20 +116,20 @@
           <w:sz w:val="23"/>
           <w:szCs w:val="23"/>
         </w:rPr>
+        <w:t xml:space="preserve">On September 8, the ACGME posted a proposed major revision of the Common Program Requirements, the rules governing every residency, presented as a 43% reduction in requirements. If you train residents, supervise them, or are one, you have two weeks to comment (they close October 22). If you care about academic integrity and faculty development, this matters.</w:t>
+      </w:r>
+    </w:p>
+    <w:p>
+      <w:pPr>
+        <w:spacing w:after="100" w:before="0" w:line="264"/>
+      </w:pPr>
+      <w:r>
+        <w:rPr>
+          <w:rFonts w:ascii="Cambria" w:cs="Cambria" w:eastAsia="Cambria" w:hAnsi="Cambria"/>
+          <w:sz w:val="23"/>
+          <w:szCs w:val="23"/>
+        </w:rPr>
         <w:t xml:space="preserve">Since 2014, ACGME-accredited emergency medicine residencies have grown from 160 to 304, and 86 percent of new programs are at non-university corporate, private equity, or community sites. Those programs have fewer faculty, less protected time, less rank advancement, less funded research, less student teaching, and lower scholarly productivity, which limits new academic faculty and stunts the science. ACGME requirements set a program's minimums, including protected faculty time and scholarly activity.</w:t>
-      </w:r>
-    </w:p>
-    <w:p>
-      <w:pPr>
-        <w:spacing w:after="100" w:before="0" w:line="264"/>
-      </w:pPr>
-      <w:r>
-        <w:rPr>
-          <w:rFonts w:ascii="Cambria" w:cs="Cambria" w:eastAsia="Cambria" w:hAnsi="Cambria"/>
-          <w:sz w:val="23"/>
-          <w:szCs w:val="23"/>
-        </w:rPr>
-        <w:t xml:space="preserve">On September 8, the ACGME posted a proposed major revision of the Common Program Requirements, the rules governing every residency, presented as a 43% reduction in requirements. If you train residents, supervise them, or are one, you have two weeks to comment (they close October 22). If you care about academic integrity and faculty development, this matters.</w:t>
       </w:r>
     </w:p>
     <w:p>
@@ -474,7 +474,7 @@
         </w:rPr>
         <w:t xml:space="preserve">The comment form is at </w:t>
       </w:r>
-      <w:hyperlink w:history="1" r:id="rId8greavpje1pydjvmeyxgw">
+      <w:hyperlink w:history="1" r:id="rIdns1j3h3ebgeocycfvn1iz">
         <w:r>
           <w:rPr>
             <w:rStyle w:val="Hyperlink"/>
@@ -509,7 +509,7 @@
         </w:rPr>
         <w:t xml:space="preserve">To view my responses and suggested considerations for your own response, please go to </w:t>
       </w:r>
-      <w:hyperlink w:history="1" r:id="rId3oz1-ue_rsh804ypzg6d7">
+      <w:hyperlink w:history="1" r:id="rIdfzp2irsebnbhmz57emkji">
         <w:r>
           <w:rPr>
             <w:rStyle w:val="Hyperlink"/>
@@ -568,7 +568,7 @@
         </w:rPr>
         <w:t xml:space="preserve">Sources: </w:t>
       </w:r>
-      <w:hyperlink w:history="1" r:id="rIdbjxkcvxcripbebdojowtb">
+      <w:hyperlink w:history="1" r:id="rIdckby9owxrihvih69sjakf">
         <w:r>
           <w:rPr>
             <w:rStyle w:val="Hyperlink"/>
@@ -588,7 +588,7 @@
         </w:rPr>
         <w:t xml:space="preserve">. </w:t>
       </w:r>
-      <w:hyperlink w:history="1" r:id="rIdhyid3akbluv3elivqo1-u">
+      <w:hyperlink w:history="1" r:id="rIdspk6tpn90gddymaayhxyc">
         <w:r>
           <w:rPr>
             <w:rStyle w:val="Hyperlink"/>

</xml_diff>